<commit_message>
Added actividades primera sesión virtual
</commit_message>
<xml_diff>
--- a/Tareas realizadas Word/EVALUACION DIAGNOSTICA 2026.docx
+++ b/Tareas realizadas Word/EVALUACION DIAGNOSTICA 2026.docx
@@ -284,6 +284,7 @@
         <w:ind w:left="348"/>
         <w:rPr>
           <w:rFonts w:ascii="Arial" w:hAnsi="Arial" w:cs="Arial"/>
+          <w:spacing w:val="-2"/>
         </w:rPr>
       </w:pPr>
       <w:r>
@@ -336,8 +337,235 @@
           <w:rFonts w:ascii="Arial" w:hAnsi="Arial" w:cs="Arial"/>
           <w:spacing w:val="-2"/>
         </w:rPr>
-        <w:t xml:space="preserve"> Gerson Antonio Valdivia</w:t>
-      </w:r>
+        <w:t xml:space="preserve"> </w:t>
+      </w:r>
+    </w:p>
+    <w:p>
+      <w:pPr>
+        <w:spacing w:before="239"/>
+        <w:ind w:left="348"/>
+        <w:rPr>
+          <w:rFonts w:ascii="Arial" w:hAnsi="Arial" w:cs="Arial"/>
+          <w:spacing w:val="-2"/>
+        </w:rPr>
+      </w:pPr>
+      <w:r>
+        <w:rPr>
+          <w:rFonts w:ascii="Arial" w:hAnsi="Arial" w:cs="Arial"/>
+          <w:spacing w:val="-2"/>
+        </w:rPr>
+        <w:t xml:space="preserve">Br. </w:t>
+      </w:r>
+      <w:r>
+        <w:rPr>
+          <w:rFonts w:ascii="Arial" w:hAnsi="Arial" w:cs="Arial"/>
+          <w:spacing w:val="-2"/>
+        </w:rPr>
+        <w:t>Gerson Antonio Valdivia</w:t>
+      </w:r>
+    </w:p>
+    <w:p>
+      <w:pPr>
+        <w:ind w:firstLine="348"/>
+        <w:rPr>
+          <w:rFonts w:ascii="Arial" w:hAnsi="Arial" w:cs="Arial"/>
+          <w:lang w:val="es-NI"/>
+        </w:rPr>
+      </w:pPr>
+      <w:r>
+        <w:rPr>
+          <w:rFonts w:ascii="Arial" w:hAnsi="Arial" w:cs="Arial"/>
+          <w:lang w:val="es-NI"/>
+        </w:rPr>
+        <w:t xml:space="preserve">Br. </w:t>
+      </w:r>
+      <w:proofErr w:type="spellStart"/>
+      <w:r>
+        <w:rPr>
+          <w:rFonts w:ascii="Arial" w:hAnsi="Arial" w:cs="Arial"/>
+          <w:lang w:val="es-NI"/>
+        </w:rPr>
+        <w:t>Quiezel</w:t>
+      </w:r>
+      <w:proofErr w:type="spellEnd"/>
+      <w:r>
+        <w:rPr>
+          <w:rFonts w:ascii="Arial" w:hAnsi="Arial" w:cs="Arial"/>
+          <w:lang w:val="es-NI"/>
+        </w:rPr>
+        <w:t xml:space="preserve"> </w:t>
+      </w:r>
+      <w:proofErr w:type="spellStart"/>
+      <w:r>
+        <w:rPr>
+          <w:rFonts w:ascii="Arial" w:hAnsi="Arial" w:cs="Arial"/>
+          <w:lang w:val="es-NI"/>
+        </w:rPr>
+        <w:t>Sinai</w:t>
+      </w:r>
+      <w:proofErr w:type="spellEnd"/>
+      <w:r>
+        <w:rPr>
+          <w:rFonts w:ascii="Arial" w:hAnsi="Arial" w:cs="Arial"/>
+          <w:lang w:val="es-NI"/>
+        </w:rPr>
+        <w:t xml:space="preserve"> </w:t>
+      </w:r>
+      <w:proofErr w:type="spellStart"/>
+      <w:r>
+        <w:rPr>
+          <w:rFonts w:ascii="Arial" w:hAnsi="Arial" w:cs="Arial"/>
+          <w:lang w:val="es-NI"/>
+        </w:rPr>
+        <w:t>Villagra</w:t>
+      </w:r>
+      <w:proofErr w:type="spellEnd"/>
+      <w:r>
+        <w:rPr>
+          <w:rFonts w:ascii="Arial" w:hAnsi="Arial" w:cs="Arial"/>
+          <w:lang w:val="es-NI"/>
+        </w:rPr>
+        <w:t xml:space="preserve"> Mena</w:t>
+      </w:r>
+    </w:p>
+    <w:p>
+      <w:pPr>
+        <w:ind w:firstLine="348"/>
+        <w:rPr>
+          <w:rFonts w:ascii="Arial" w:hAnsi="Arial" w:cs="Arial"/>
+        </w:rPr>
+      </w:pPr>
+      <w:r>
+        <w:rPr>
+          <w:rFonts w:ascii="Arial" w:hAnsi="Arial" w:cs="Arial"/>
+        </w:rPr>
+        <w:t xml:space="preserve">Br. Cesar </w:t>
+      </w:r>
+      <w:r>
+        <w:rPr>
+          <w:rFonts w:ascii="Arial" w:hAnsi="Arial" w:cs="Arial"/>
+        </w:rPr>
+        <w:t xml:space="preserve">José </w:t>
+      </w:r>
+      <w:r>
+        <w:rPr>
+          <w:rFonts w:ascii="Arial" w:hAnsi="Arial" w:cs="Arial"/>
+        </w:rPr>
+        <w:t>Cerda</w:t>
+      </w:r>
+      <w:r>
+        <w:rPr>
+          <w:rFonts w:ascii="Arial" w:hAnsi="Arial" w:cs="Arial"/>
+        </w:rPr>
+        <w:t xml:space="preserve"> Maldonado</w:t>
+      </w:r>
+    </w:p>
+    <w:p>
+      <w:pPr>
+        <w:ind w:firstLine="348"/>
+        <w:rPr>
+          <w:rFonts w:ascii="Arial" w:hAnsi="Arial" w:cs="Arial"/>
+        </w:rPr>
+      </w:pPr>
+      <w:r>
+        <w:rPr>
+          <w:rFonts w:ascii="Arial" w:hAnsi="Arial" w:cs="Arial"/>
+          <w:lang w:val="en-US"/>
+        </w:rPr>
+        <w:t xml:space="preserve">Br. </w:t>
+      </w:r>
+      <w:proofErr w:type="spellStart"/>
+      <w:r>
+        <w:rPr>
+          <w:rFonts w:ascii="Arial" w:hAnsi="Arial" w:cs="Arial"/>
+          <w:lang w:val="en-US"/>
+        </w:rPr>
+        <w:t>Neyli</w:t>
+      </w:r>
+      <w:proofErr w:type="spellEnd"/>
+      <w:r>
+        <w:rPr>
+          <w:rFonts w:ascii="Arial" w:hAnsi="Arial" w:cs="Arial"/>
+          <w:lang w:val="en-US"/>
+        </w:rPr>
+        <w:t xml:space="preserve"> </w:t>
+      </w:r>
+      <w:proofErr w:type="spellStart"/>
+      <w:r>
+        <w:rPr>
+          <w:rFonts w:ascii="Arial" w:hAnsi="Arial" w:cs="Arial"/>
+          <w:lang w:val="en-US"/>
+        </w:rPr>
+        <w:t>Arlette</w:t>
+      </w:r>
+      <w:proofErr w:type="spellEnd"/>
+      <w:r>
+        <w:rPr>
+          <w:rFonts w:ascii="Arial" w:hAnsi="Arial" w:cs="Arial"/>
+          <w:lang w:val="en-US"/>
+        </w:rPr>
+        <w:t xml:space="preserve"> Madriz </w:t>
+      </w:r>
+      <w:proofErr w:type="spellStart"/>
+      <w:r>
+        <w:rPr>
+          <w:rFonts w:ascii="Arial" w:hAnsi="Arial" w:cs="Arial"/>
+          <w:lang w:val="en-US"/>
+        </w:rPr>
+        <w:t>Soval</w:t>
+      </w:r>
+      <w:r>
+        <w:rPr>
+          <w:rFonts w:ascii="Arial" w:hAnsi="Arial" w:cs="Arial"/>
+          <w:lang w:val="en-US"/>
+        </w:rPr>
+        <w:t>barro</w:t>
+      </w:r>
+      <w:proofErr w:type="spellEnd"/>
+    </w:p>
+    <w:p>
+      <w:pPr>
+        <w:ind w:firstLine="348"/>
+        <w:rPr>
+          <w:rFonts w:ascii="Arial" w:hAnsi="Arial" w:cs="Arial"/>
+          <w:lang w:val="en-US"/>
+        </w:rPr>
+      </w:pPr>
+      <w:r>
+        <w:rPr>
+          <w:rFonts w:ascii="Arial" w:hAnsi="Arial" w:cs="Arial"/>
+          <w:lang w:val="en-US"/>
+        </w:rPr>
+        <w:t xml:space="preserve">Br. Dorian Wilfred </w:t>
+      </w:r>
+      <w:proofErr w:type="spellStart"/>
+      <w:r>
+        <w:rPr>
+          <w:rFonts w:ascii="Arial" w:hAnsi="Arial" w:cs="Arial"/>
+          <w:lang w:val="en-US"/>
+        </w:rPr>
+        <w:t>Lanuza</w:t>
+      </w:r>
+      <w:proofErr w:type="spellEnd"/>
+      <w:r>
+        <w:rPr>
+          <w:rFonts w:ascii="Arial" w:hAnsi="Arial" w:cs="Arial"/>
+          <w:lang w:val="en-US"/>
+        </w:rPr>
+        <w:t xml:space="preserve"> Smith</w:t>
+      </w:r>
+      <w:bookmarkStart w:id="0" w:name="_GoBack"/>
+      <w:bookmarkEnd w:id="0"/>
+    </w:p>
+    <w:p>
+      <w:pPr>
+        <w:spacing w:before="239"/>
+        <w:ind w:left="348"/>
+        <w:rPr>
+          <w:rFonts w:ascii="Arial" w:hAnsi="Arial" w:cs="Arial"/>
+          <w:lang w:val="en-US"/>
+        </w:rPr>
+      </w:pPr>
     </w:p>
     <w:p>
       <w:pPr>
@@ -593,19 +821,7 @@
         <w:rPr>
           <w:rFonts w:ascii="Arial" w:hAnsi="Arial" w:cs="Arial"/>
         </w:rPr>
-        <w:t>La</w:t>
-      </w:r>
-      <w:r>
-        <w:rPr>
-          <w:rFonts w:ascii="Arial" w:hAnsi="Arial" w:cs="Arial"/>
-        </w:rPr>
-        <w:t xml:space="preserve"> administración general se enfoca en la gestión universal de los recursos de una empresa (humanos, financieros, materiales) para alcanzar los objetivos organizacionales. La administración informática (o Gerencia de TI), por su parte, es una disciplina especializada que toma esos principios universales y los aplica exclusivamente a los activos tecnológicos (hardware, software, redes, datos y personal técnico). Su principal diferencia y reto es la Alineación Estratégica: la administración informática no solo mantiene equipos encendidos, sino que garantiza que la tecnología sea un habilitador para el negocio</w:t>
-      </w:r>
-      <w:r>
-        <w:rPr>
-          <w:rFonts w:ascii="Arial" w:hAnsi="Arial" w:cs="Arial"/>
-        </w:rPr>
-        <w:t>.</w:t>
+        <w:t>La administración general se enfoca en la gestión universal de los recursos de una empresa (humanos, financieros, materiales) para alcanzar los objetivos organizacionales. La administración informática (o Gerencia de TI), por su parte, es una disciplina especializada que toma esos principios universales y los aplica exclusivamente a los activos tecnológicos (hardware, software, redes, datos y personal técnico). Su principal diferencia y reto es la Alineación Estratégica: la administración informática no solo mantiene equipos encendidos, sino que garantiza que la tecnología sea un habilitador para el negocio.</w:t>
       </w:r>
     </w:p>
     <w:p>
@@ -1166,7 +1382,6 @@
           <w:spacing w:val="-4"/>
           <w:sz w:val="24"/>
         </w:rPr>
-        <w:lastRenderedPageBreak/>
         <w:t>Cuál</w:t>
       </w:r>
       <w:r>
@@ -2185,7 +2400,14 @@
         <w:rPr>
           <w:rFonts w:ascii="Arial" w:hAnsi="Arial" w:cs="Arial"/>
         </w:rPr>
-        <w:t>) garantizando la capacidad de recuperación. Finalmente, se realiza el monitoreo y optimización (</w:t>
+        <w:t xml:space="preserve">) garantizando la capacidad de recuperación. </w:t>
+      </w:r>
+      <w:r>
+        <w:rPr>
+          <w:rFonts w:ascii="Arial" w:hAnsi="Arial" w:cs="Arial"/>
+        </w:rPr>
+        <w:lastRenderedPageBreak/>
+        <w:t>Finalmente, se realiza el monitoreo y optimización (</w:t>
       </w:r>
       <w:proofErr w:type="spellStart"/>
       <w:r>
@@ -2249,7 +2471,6 @@
           <w:rFonts w:ascii="Arial" w:hAnsi="Arial" w:cs="Arial"/>
           <w:sz w:val="24"/>
         </w:rPr>
-        <w:lastRenderedPageBreak/>
         <w:t>Explique</w:t>
       </w:r>
       <w:r>
@@ -2999,7 +3220,6 @@
           <w:rFonts w:ascii="Arial" w:hAnsi="Arial" w:cs="Arial"/>
           <w:sz w:val="24"/>
         </w:rPr>
-        <w:lastRenderedPageBreak/>
         <w:t>En</w:t>
       </w:r>
       <w:r>
@@ -3239,15 +3459,7 @@
         <w:rPr>
           <w:rFonts w:ascii="Arial" w:hAnsi="Arial" w:cs="Arial"/>
         </w:rPr>
-        <w:t>), especialmente en lider</w:t>
-      </w:r>
-      <w:bookmarkStart w:id="0" w:name="_GoBack"/>
-      <w:bookmarkEnd w:id="0"/>
-      <w:r>
-        <w:rPr>
-          <w:rFonts w:ascii="Arial" w:hAnsi="Arial" w:cs="Arial"/>
-        </w:rPr>
-        <w:t>azgo de equipos, resolución de conflictos y comunicación asertiva para negociar requerimientos con la Alta Dirección. Asimismo, requeriría adquirir mayores conocimientos financieros para elaborar presupuestos y justificar el retorno de inversión (ROI) de la tecnología, complementándolo con un dominio más profundo de marcos de trabajo gerenciales como ITIL, COBIT y normativas ISO.</w:t>
+        <w:t>), especialmente en liderazgo de equipos, resolución de conflictos y comunicación asertiva para negociar requerimientos con la Alta Dirección. Asimismo, requeriría adquirir mayores conocimientos financieros para elaborar presupuestos y justificar el retorno de inversión (ROI) de la tecnología, complementándolo con un dominio más profundo de marcos de trabajo gerenciales como ITIL, COBIT y normativas ISO.</w:t>
       </w:r>
     </w:p>
     <w:sectPr>
@@ -3974,6 +4186,7 @@
   <w:style w:type="character" w:default="1" w:styleId="Fuentedeprrafopredeter">
     <w:name w:val="Default Paragraph Font"/>
     <w:uiPriority w:val="1"/>
+    <w:semiHidden/>
     <w:unhideWhenUsed/>
   </w:style>
   <w:style w:type="table" w:default="1" w:styleId="Tablanormal">
@@ -4285,6 +4498,7 @@
   <w:style w:type="character" w:default="1" w:styleId="Fuentedeprrafopredeter">
     <w:name w:val="Default Paragraph Font"/>
     <w:uiPriority w:val="1"/>
+    <w:semiHidden/>
     <w:unhideWhenUsed/>
   </w:style>
   <w:style w:type="table" w:default="1" w:styleId="Tablanormal">

</xml_diff>